<commit_message>
Actualizacion de nombre y version del documento
</commit_message>
<xml_diff>
--- a/Documentacion/CASOS_DE_USO (2).docx
+++ b/Documentacion/CASOS_DE_USO (2).docx
@@ -1,6 +1,6 @@
 
 <file path=word/document.xml><?xml version="1.0" encoding="utf-8"?>
-<w:document xmlns:wpc="http://schemas.microsoft.com/office/word/2010/wordprocessingCanvas" xmlns:cx="http://schemas.microsoft.com/office/drawing/2014/chartex" xmlns:cx1="http://schemas.microsoft.com/office/drawing/2015/9/8/chartex" xmlns:cx2="http://schemas.microsoft.com/office/drawing/2015/10/21/chartex" xmlns:cx3="http://schemas.microsoft.com/office/drawing/2016/5/9/chartex" xmlns:cx4="http://schemas.microsoft.com/office/drawing/2016/5/10/chartex" xmlns:cx5="http://schemas.microsoft.com/office/drawing/2016/5/11/chartex" xmlns:cx6="http://schemas.microsoft.com/office/drawing/2016/5/12/chartex" xmlns:cx7="http://schemas.microsoft.com/office/drawing/2016/5/13/chartex" xmlns:cx8="http://schemas.microsoft.com/office/drawing/2016/5/14/chartex" xmlns:mc="http://schemas.openxmlformats.org/markup-compatibility/2006" xmlns:aink="http://schemas.microsoft.com/office/drawing/2016/ink" xmlns:am3d="http://schemas.microsoft.com/office/drawing/2017/model3d" xmlns:o="urn:schemas-microsoft-com:office:office" xmlns:oel="http://schemas.microsoft.com/office/2019/extlst" xmlns:r="http://schemas.openxmlformats.org/officeDocument/2006/relationships" xmlns:m="http://schemas.openxmlformats.org/officeDocument/2006/math" xmlns:v="urn:schemas-microsoft-com:vml" xmlns:wp14="http://schemas.microsoft.com/office/word/2010/wordprocessingDrawing" xmlns:wp="http://schemas.openxmlformats.org/drawingml/2006/wordprocessingDrawing" xmlns:w10="urn:schemas-microsoft-com:office:word" xmlns:w="http://schemas.openxmlformats.org/wordprocessingml/2006/main" xmlns:w14="http://schemas.microsoft.com/office/word/2010/wordml" xmlns:w15="http://schemas.microsoft.com/office/word/2012/wordml" xmlns:w16cex="http://schemas.microsoft.com/office/word/2018/wordml/cex" xmlns:w16cid="http://schemas.microsoft.com/office/word/2016/wordml/cid" xmlns:w16="http://schemas.microsoft.com/office/word/2018/wordml" xmlns:w16du="http://schemas.microsoft.com/office/word/2023/wordml/word16du" xmlns:w16sdtdh="http://schemas.microsoft.com/office/word/2020/wordml/sdtdatahash" xmlns:w16sdtfl="http://schemas.microsoft.com/office/word/2024/wordml/sdtformatlock" xmlns:w16se="http://schemas.microsoft.com/office/word/2015/wordml/symex" xmlns:wpg="http://schemas.microsoft.com/office/word/2010/wordprocessingGroup" xmlns:wpi="http://schemas.microsoft.com/office/word/2010/wordprocessingInk" xmlns:wne="http://schemas.microsoft.com/office/word/2006/wordml" xmlns:wps="http://schemas.microsoft.com/office/word/2010/wordprocessingShape" mc:Ignorable="w14 w15 w16se w16cid w16 w16cex w16sdtdh w16sdtfl w16du wp14">
+<w:document xmlns:wpc="http://schemas.microsoft.com/office/word/2010/wordprocessingCanvas" xmlns:cx="http://schemas.microsoft.com/office/drawing/2014/chartex" xmlns:cx1="http://schemas.microsoft.com/office/drawing/2015/9/8/chartex" xmlns:cx2="http://schemas.microsoft.com/office/drawing/2015/10/21/chartex" xmlns:cx3="http://schemas.microsoft.com/office/drawing/2016/5/9/chartex" xmlns:cx4="http://schemas.microsoft.com/office/drawing/2016/5/10/chartex" xmlns:cx5="http://schemas.microsoft.com/office/drawing/2016/5/11/chartex" xmlns:cx6="http://schemas.microsoft.com/office/drawing/2016/5/12/chartex" xmlns:cx7="http://schemas.microsoft.com/office/drawing/2016/5/13/chartex" xmlns:cx8="http://schemas.microsoft.com/office/drawing/2016/5/14/chartex" xmlns:mc="http://schemas.openxmlformats.org/markup-compatibility/2006" xmlns:aink="http://schemas.microsoft.com/office/drawing/2016/ink" xmlns:am3d="http://schemas.microsoft.com/office/drawing/2017/model3d" xmlns:o="urn:schemas-microsoft-com:office:office" xmlns:oel="http://schemas.microsoft.com/office/2019/extlst" xmlns:r="http://schemas.openxmlformats.org/officeDocument/2006/relationships" xmlns:m="http://schemas.openxmlformats.org/officeDocument/2006/math" xmlns:v="urn:schemas-microsoft-com:vml" xmlns:wp14="http://schemas.microsoft.com/office/word/2010/wordprocessingDrawing" xmlns:wp="http://schemas.openxmlformats.org/drawingml/2006/wordprocessingDrawing" xmlns:w10="urn:schemas-microsoft-com:office:word" xmlns:w="http://schemas.openxmlformats.org/wordprocessingml/2006/main" xmlns:w14="http://schemas.microsoft.com/office/word/2010/wordml" xmlns:w15="http://schemas.microsoft.com/office/word/2012/wordml" xmlns:w16cex="http://schemas.microsoft.com/office/word/2018/wordml/cex" xmlns:w16cid="http://schemas.microsoft.com/office/word/2016/wordml/cid" xmlns:w16="http://schemas.microsoft.com/office/word/2018/wordml" xmlns:w16sdtdh="http://schemas.microsoft.com/office/word/2020/wordml/sdtdatahash" xmlns:w16se="http://schemas.microsoft.com/office/word/2015/wordml/symex" xmlns:wpg="http://schemas.microsoft.com/office/word/2010/wordprocessingGroup" xmlns:wpi="http://schemas.microsoft.com/office/word/2010/wordprocessingInk" xmlns:wne="http://schemas.microsoft.com/office/word/2006/wordml" xmlns:wps="http://schemas.microsoft.com/office/word/2010/wordprocessingShape" mc:Ignorable="w14 w15 w16se w16cid w16 w16cex w16sdtdh wp14">
   <w:body>
     <w:p>
       <w:pPr>
@@ -563,7 +563,7 @@
                 <w:sz w:val="27"/>
                 <w:szCs w:val="27"/>
               </w:rPr>
-              <w:t>TICO AI</w:t>
+              <w:t>TICO</w:t>
             </w:r>
           </w:p>
         </w:tc>
@@ -628,7 +628,15 @@
                 <w:sz w:val="27"/>
                 <w:szCs w:val="27"/>
               </w:rPr>
-              <w:t>1.0</w:t>
+              <w:t>1.</w:t>
+            </w:r>
+            <w:r>
+              <w:rPr>
+                <w:rFonts w:cstheme="minorHAnsi"/>
+                <w:sz w:val="27"/>
+                <w:szCs w:val="27"/>
+              </w:rPr>
+              <w:t>5</w:t>
             </w:r>
           </w:p>
         </w:tc>
@@ -2579,27 +2587,7 @@
                 <w:sz w:val="22"/>
                 <w:szCs w:val="22"/>
               </w:rPr>
-              <w:t xml:space="preserve">El sistema autentica al jugador y </w:t>
-            </w:r>
-            <w:proofErr w:type="gramStart"/>
-            <w:r>
-              <w:rPr>
-                <w:rFonts w:eastAsia="Google Sans Text"/>
-                <w:color w:val="1B1C1D"/>
-                <w:sz w:val="22"/>
-                <w:szCs w:val="22"/>
-              </w:rPr>
-              <w:t>le</w:t>
-            </w:r>
-            <w:proofErr w:type="gramEnd"/>
-            <w:r>
-              <w:rPr>
-                <w:rFonts w:eastAsia="Google Sans Text"/>
-                <w:color w:val="1B1C1D"/>
-                <w:sz w:val="22"/>
-                <w:szCs w:val="22"/>
-              </w:rPr>
-              <w:t xml:space="preserve"> da acceso a las funcionalidades principales del juego.</w:t>
+              <w:t>El sistema autentica al jugador y le da acceso a las funcionalidades principales del juego.</w:t>
             </w:r>
           </w:p>
         </w:tc>
@@ -9401,7 +9389,7 @@
 </file>
 
 <file path=word/numbering.xml><?xml version="1.0" encoding="utf-8"?>
-<w:numbering xmlns:wpc="http://schemas.microsoft.com/office/word/2010/wordprocessingCanvas" xmlns:cx="http://schemas.microsoft.com/office/drawing/2014/chartex" xmlns:cx1="http://schemas.microsoft.com/office/drawing/2015/9/8/chartex" xmlns:cx2="http://schemas.microsoft.com/office/drawing/2015/10/21/chartex" xmlns:cx3="http://schemas.microsoft.com/office/drawing/2016/5/9/chartex" xmlns:cx4="http://schemas.microsoft.com/office/drawing/2016/5/10/chartex" xmlns:cx5="http://schemas.microsoft.com/office/drawing/2016/5/11/chartex" xmlns:cx6="http://schemas.microsoft.com/office/drawing/2016/5/12/chartex" xmlns:cx7="http://schemas.microsoft.com/office/drawing/2016/5/13/chartex" xmlns:cx8="http://schemas.microsoft.com/office/drawing/2016/5/14/chartex" xmlns:mc="http://schemas.openxmlformats.org/markup-compatibility/2006" xmlns:aink="http://schemas.microsoft.com/office/drawing/2016/ink" xmlns:am3d="http://schemas.microsoft.com/office/drawing/2017/model3d" xmlns:o="urn:schemas-microsoft-com:office:office" xmlns:oel="http://schemas.microsoft.com/office/2019/extlst" xmlns:r="http://schemas.openxmlformats.org/officeDocument/2006/relationships" xmlns:m="http://schemas.openxmlformats.org/officeDocument/2006/math" xmlns:v="urn:schemas-microsoft-com:vml" xmlns:wp14="http://schemas.microsoft.com/office/word/2010/wordprocessingDrawing" xmlns:wp="http://schemas.openxmlformats.org/drawingml/2006/wordprocessingDrawing" xmlns:w10="urn:schemas-microsoft-com:office:word" xmlns:w="http://schemas.openxmlformats.org/wordprocessingml/2006/main" xmlns:w14="http://schemas.microsoft.com/office/word/2010/wordml" xmlns:w15="http://schemas.microsoft.com/office/word/2012/wordml" xmlns:w16cex="http://schemas.microsoft.com/office/word/2018/wordml/cex" xmlns:w16cid="http://schemas.microsoft.com/office/word/2016/wordml/cid" xmlns:w16="http://schemas.microsoft.com/office/word/2018/wordml" xmlns:w16du="http://schemas.microsoft.com/office/word/2023/wordml/word16du" xmlns:w16sdtdh="http://schemas.microsoft.com/office/word/2020/wordml/sdtdatahash" xmlns:w16sdtfl="http://schemas.microsoft.com/office/word/2024/wordml/sdtformatlock" xmlns:w16se="http://schemas.microsoft.com/office/word/2015/wordml/symex" xmlns:wpg="http://schemas.microsoft.com/office/word/2010/wordprocessingGroup" xmlns:wpi="http://schemas.microsoft.com/office/word/2010/wordprocessingInk" xmlns:wne="http://schemas.microsoft.com/office/word/2006/wordml" xmlns:wps="http://schemas.microsoft.com/office/word/2010/wordprocessingShape" mc:Ignorable="w14 w15 w16se w16cid w16 w16cex w16sdtdh w16sdtfl w16du wp14">
+<w:numbering xmlns:wpc="http://schemas.microsoft.com/office/word/2010/wordprocessingCanvas" xmlns:cx="http://schemas.microsoft.com/office/drawing/2014/chartex" xmlns:cx1="http://schemas.microsoft.com/office/drawing/2015/9/8/chartex" xmlns:cx2="http://schemas.microsoft.com/office/drawing/2015/10/21/chartex" xmlns:cx3="http://schemas.microsoft.com/office/drawing/2016/5/9/chartex" xmlns:cx4="http://schemas.microsoft.com/office/drawing/2016/5/10/chartex" xmlns:cx5="http://schemas.microsoft.com/office/drawing/2016/5/11/chartex" xmlns:cx6="http://schemas.microsoft.com/office/drawing/2016/5/12/chartex" xmlns:cx7="http://schemas.microsoft.com/office/drawing/2016/5/13/chartex" xmlns:cx8="http://schemas.microsoft.com/office/drawing/2016/5/14/chartex" xmlns:mc="http://schemas.openxmlformats.org/markup-compatibility/2006" xmlns:aink="http://schemas.microsoft.com/office/drawing/2016/ink" xmlns:am3d="http://schemas.microsoft.com/office/drawing/2017/model3d" xmlns:o="urn:schemas-microsoft-com:office:office" xmlns:oel="http://schemas.microsoft.com/office/2019/extlst" xmlns:r="http://schemas.openxmlformats.org/officeDocument/2006/relationships" xmlns:m="http://schemas.openxmlformats.org/officeDocument/2006/math" xmlns:v="urn:schemas-microsoft-com:vml" xmlns:wp14="http://schemas.microsoft.com/office/word/2010/wordprocessingDrawing" xmlns:wp="http://schemas.openxmlformats.org/drawingml/2006/wordprocessingDrawing" xmlns:w10="urn:schemas-microsoft-com:office:word" xmlns:w="http://schemas.openxmlformats.org/wordprocessingml/2006/main" xmlns:w14="http://schemas.microsoft.com/office/word/2010/wordml" xmlns:w15="http://schemas.microsoft.com/office/word/2012/wordml" xmlns:w16cex="http://schemas.microsoft.com/office/word/2018/wordml/cex" xmlns:w16cid="http://schemas.microsoft.com/office/word/2016/wordml/cid" xmlns:w16="http://schemas.microsoft.com/office/word/2018/wordml" xmlns:w16sdtdh="http://schemas.microsoft.com/office/word/2020/wordml/sdtdatahash" xmlns:w16se="http://schemas.microsoft.com/office/word/2015/wordml/symex" xmlns:wpg="http://schemas.microsoft.com/office/word/2010/wordprocessingGroup" xmlns:wpi="http://schemas.microsoft.com/office/word/2010/wordprocessingInk" xmlns:wne="http://schemas.microsoft.com/office/word/2006/wordml" xmlns:wps="http://schemas.microsoft.com/office/word/2010/wordprocessingShape" mc:Ignorable="w14 w15 w16se w16cid w16 w16cex w16sdtdh wp14">
   <w:abstractNum w:abstractNumId="0" w15:restartNumberingAfterBreak="0">
     <w:nsid w:val="035572D6"/>
     <w:multiLevelType w:val="hybridMultilevel"/>
@@ -10453,7 +10441,7 @@
 </file>
 
 <file path=word/styles.xml><?xml version="1.0" encoding="utf-8"?>
-<w:styles xmlns:mc="http://schemas.openxmlformats.org/markup-compatibility/2006" xmlns:r="http://schemas.openxmlformats.org/officeDocument/2006/relationships" xmlns:w="http://schemas.openxmlformats.org/wordprocessingml/2006/main" xmlns:w14="http://schemas.microsoft.com/office/word/2010/wordml" xmlns:w15="http://schemas.microsoft.com/office/word/2012/wordml" xmlns:w16cex="http://schemas.microsoft.com/office/word/2018/wordml/cex" xmlns:w16cid="http://schemas.microsoft.com/office/word/2016/wordml/cid" xmlns:w16="http://schemas.microsoft.com/office/word/2018/wordml" xmlns:w16du="http://schemas.microsoft.com/office/word/2023/wordml/word16du" xmlns:w16sdtdh="http://schemas.microsoft.com/office/word/2020/wordml/sdtdatahash" xmlns:w16sdtfl="http://schemas.microsoft.com/office/word/2024/wordml/sdtformatlock" xmlns:w16se="http://schemas.microsoft.com/office/word/2015/wordml/symex" mc:Ignorable="w14 w15 w16se w16cid w16 w16cex w16sdtdh w16sdtfl w16du">
+<w:styles xmlns:mc="http://schemas.openxmlformats.org/markup-compatibility/2006" xmlns:r="http://schemas.openxmlformats.org/officeDocument/2006/relationships" xmlns:w="http://schemas.openxmlformats.org/wordprocessingml/2006/main" xmlns:w14="http://schemas.microsoft.com/office/word/2010/wordml" xmlns:w15="http://schemas.microsoft.com/office/word/2012/wordml" xmlns:w16cex="http://schemas.microsoft.com/office/word/2018/wordml/cex" xmlns:w16cid="http://schemas.microsoft.com/office/word/2016/wordml/cid" xmlns:w16="http://schemas.microsoft.com/office/word/2018/wordml" xmlns:w16sdtdh="http://schemas.microsoft.com/office/word/2020/wordml/sdtdatahash" xmlns:w16se="http://schemas.microsoft.com/office/word/2015/wordml/symex" mc:Ignorable="w14 w15 w16se w16cid w16 w16cex w16sdtdh">
   <w:docDefaults>
     <w:rPrDefault>
       <w:rPr>
@@ -10899,6 +10887,7 @@
   <w:style w:type="character" w:default="1" w:styleId="Fuentedeprrafopredeter">
     <w:name w:val="Default Paragraph Font"/>
     <w:uiPriority w:val="1"/>
+    <w:semiHidden/>
     <w:unhideWhenUsed/>
   </w:style>
   <w:style w:type="table" w:default="1" w:styleId="Tablanormal">

</xml_diff>

<commit_message>
Correción de fecha y  nombre de proyecto
</commit_message>
<xml_diff>
--- a/Documentacion/CASOS_DE_USO (2).docx
+++ b/Documentacion/CASOS_DE_USO (2).docx
@@ -1,6 +1,6 @@
 
 <file path=word/document.xml><?xml version="1.0" encoding="utf-8"?>
-<w:document xmlns:wpc="http://schemas.microsoft.com/office/word/2010/wordprocessingCanvas" xmlns:cx="http://schemas.microsoft.com/office/drawing/2014/chartex" xmlns:cx1="http://schemas.microsoft.com/office/drawing/2015/9/8/chartex" xmlns:cx2="http://schemas.microsoft.com/office/drawing/2015/10/21/chartex" xmlns:cx3="http://schemas.microsoft.com/office/drawing/2016/5/9/chartex" xmlns:cx4="http://schemas.microsoft.com/office/drawing/2016/5/10/chartex" xmlns:cx5="http://schemas.microsoft.com/office/drawing/2016/5/11/chartex" xmlns:cx6="http://schemas.microsoft.com/office/drawing/2016/5/12/chartex" xmlns:cx7="http://schemas.microsoft.com/office/drawing/2016/5/13/chartex" xmlns:cx8="http://schemas.microsoft.com/office/drawing/2016/5/14/chartex" xmlns:mc="http://schemas.openxmlformats.org/markup-compatibility/2006" xmlns:aink="http://schemas.microsoft.com/office/drawing/2016/ink" xmlns:am3d="http://schemas.microsoft.com/office/drawing/2017/model3d" xmlns:o="urn:schemas-microsoft-com:office:office" xmlns:oel="http://schemas.microsoft.com/office/2019/extlst" xmlns:r="http://schemas.openxmlformats.org/officeDocument/2006/relationships" xmlns:m="http://schemas.openxmlformats.org/officeDocument/2006/math" xmlns:v="urn:schemas-microsoft-com:vml" xmlns:wp14="http://schemas.microsoft.com/office/word/2010/wordprocessingDrawing" xmlns:wp="http://schemas.openxmlformats.org/drawingml/2006/wordprocessingDrawing" xmlns:w10="urn:schemas-microsoft-com:office:word" xmlns:w="http://schemas.openxmlformats.org/wordprocessingml/2006/main" xmlns:w14="http://schemas.microsoft.com/office/word/2010/wordml" xmlns:w15="http://schemas.microsoft.com/office/word/2012/wordml" xmlns:w16cex="http://schemas.microsoft.com/office/word/2018/wordml/cex" xmlns:w16cid="http://schemas.microsoft.com/office/word/2016/wordml/cid" xmlns:w16="http://schemas.microsoft.com/office/word/2018/wordml" xmlns:w16sdtdh="http://schemas.microsoft.com/office/word/2020/wordml/sdtdatahash" xmlns:w16se="http://schemas.microsoft.com/office/word/2015/wordml/symex" xmlns:wpg="http://schemas.microsoft.com/office/word/2010/wordprocessingGroup" xmlns:wpi="http://schemas.microsoft.com/office/word/2010/wordprocessingInk" xmlns:wne="http://schemas.microsoft.com/office/word/2006/wordml" xmlns:wps="http://schemas.microsoft.com/office/word/2010/wordprocessingShape" mc:Ignorable="w14 w15 w16se w16cid w16 w16cex w16sdtdh wp14">
+<w:document xmlns:wpc="http://schemas.microsoft.com/office/word/2010/wordprocessingCanvas" xmlns:cx="http://schemas.microsoft.com/office/drawing/2014/chartex" xmlns:cx1="http://schemas.microsoft.com/office/drawing/2015/9/8/chartex" xmlns:cx2="http://schemas.microsoft.com/office/drawing/2015/10/21/chartex" xmlns:cx3="http://schemas.microsoft.com/office/drawing/2016/5/9/chartex" xmlns:cx4="http://schemas.microsoft.com/office/drawing/2016/5/10/chartex" xmlns:cx5="http://schemas.microsoft.com/office/drawing/2016/5/11/chartex" xmlns:cx6="http://schemas.microsoft.com/office/drawing/2016/5/12/chartex" xmlns:cx7="http://schemas.microsoft.com/office/drawing/2016/5/13/chartex" xmlns:cx8="http://schemas.microsoft.com/office/drawing/2016/5/14/chartex" xmlns:mc="http://schemas.openxmlformats.org/markup-compatibility/2006" xmlns:aink="http://schemas.microsoft.com/office/drawing/2016/ink" xmlns:am3d="http://schemas.microsoft.com/office/drawing/2017/model3d" xmlns:o="urn:schemas-microsoft-com:office:office" xmlns:r="http://schemas.openxmlformats.org/officeDocument/2006/relationships" xmlns:m="http://schemas.openxmlformats.org/officeDocument/2006/math" xmlns:v="urn:schemas-microsoft-com:vml" xmlns:wp14="http://schemas.microsoft.com/office/word/2010/wordprocessingDrawing" xmlns:wp="http://schemas.openxmlformats.org/drawingml/2006/wordprocessingDrawing" xmlns:w10="urn:schemas-microsoft-com:office:word" xmlns:w="http://schemas.openxmlformats.org/wordprocessingml/2006/main" xmlns:w14="http://schemas.microsoft.com/office/word/2010/wordml" xmlns:w15="http://schemas.microsoft.com/office/word/2012/wordml" xmlns:w16cex="http://schemas.microsoft.com/office/word/2018/wordml/cex" xmlns:w16cid="http://schemas.microsoft.com/office/word/2016/wordml/cid" xmlns:w16="http://schemas.microsoft.com/office/word/2018/wordml" xmlns:w16sdtdh="http://schemas.microsoft.com/office/word/2020/wordml/sdtdatahash" xmlns:w16se="http://schemas.microsoft.com/office/word/2015/wordml/symex" xmlns:wpg="http://schemas.microsoft.com/office/word/2010/wordprocessingGroup" xmlns:wpi="http://schemas.microsoft.com/office/word/2010/wordprocessingInk" xmlns:wne="http://schemas.microsoft.com/office/word/2006/wordml" xmlns:wps="http://schemas.microsoft.com/office/word/2010/wordprocessingShape" mc:Ignorable="w14 w15 w16se w16cid w16 w16cex w16sdtdh wp14">
   <w:body>
     <w:p>
       <w:pPr>
@@ -498,7 +498,15 @@
                 <w:sz w:val="27"/>
                 <w:szCs w:val="27"/>
               </w:rPr>
-              <w:t>Tecnología Interactiva para la Conducta Oposicionista</w:t>
+              <w:t xml:space="preserve">Tecnología Interactiva para </w:t>
+            </w:r>
+            <w:r>
+              <w:rPr>
+                <w:rFonts w:cstheme="minorHAnsi"/>
+                <w:sz w:val="27"/>
+                <w:szCs w:val="27"/>
+              </w:rPr>
+              <w:t>la Conducta de Oposición</w:t>
             </w:r>
           </w:p>
         </w:tc>
@@ -696,7 +704,39 @@
                 <w:sz w:val="27"/>
                 <w:szCs w:val="27"/>
               </w:rPr>
-              <w:t>11/10/2025</w:t>
+              <w:t>04</w:t>
+            </w:r>
+            <w:r>
+              <w:rPr>
+                <w:rFonts w:cstheme="minorHAnsi"/>
+                <w:sz w:val="27"/>
+                <w:szCs w:val="27"/>
+              </w:rPr>
+              <w:t>/</w:t>
+            </w:r>
+            <w:r>
+              <w:rPr>
+                <w:rFonts w:cstheme="minorHAnsi"/>
+                <w:sz w:val="27"/>
+                <w:szCs w:val="27"/>
+              </w:rPr>
+              <w:t>06</w:t>
+            </w:r>
+            <w:r>
+              <w:rPr>
+                <w:rFonts w:cstheme="minorHAnsi"/>
+                <w:sz w:val="27"/>
+                <w:szCs w:val="27"/>
+              </w:rPr>
+              <w:t>/202</w:t>
+            </w:r>
+            <w:r>
+              <w:rPr>
+                <w:rFonts w:cstheme="minorHAnsi"/>
+                <w:sz w:val="27"/>
+                <w:szCs w:val="27"/>
+              </w:rPr>
+              <w:t>6</w:t>
             </w:r>
           </w:p>
         </w:tc>
@@ -9389,7 +9429,7 @@
 </file>
 
 <file path=word/numbering.xml><?xml version="1.0" encoding="utf-8"?>
-<w:numbering xmlns:wpc="http://schemas.microsoft.com/office/word/2010/wordprocessingCanvas" xmlns:cx="http://schemas.microsoft.com/office/drawing/2014/chartex" xmlns:cx1="http://schemas.microsoft.com/office/drawing/2015/9/8/chartex" xmlns:cx2="http://schemas.microsoft.com/office/drawing/2015/10/21/chartex" xmlns:cx3="http://schemas.microsoft.com/office/drawing/2016/5/9/chartex" xmlns:cx4="http://schemas.microsoft.com/office/drawing/2016/5/10/chartex" xmlns:cx5="http://schemas.microsoft.com/office/drawing/2016/5/11/chartex" xmlns:cx6="http://schemas.microsoft.com/office/drawing/2016/5/12/chartex" xmlns:cx7="http://schemas.microsoft.com/office/drawing/2016/5/13/chartex" xmlns:cx8="http://schemas.microsoft.com/office/drawing/2016/5/14/chartex" xmlns:mc="http://schemas.openxmlformats.org/markup-compatibility/2006" xmlns:aink="http://schemas.microsoft.com/office/drawing/2016/ink" xmlns:am3d="http://schemas.microsoft.com/office/drawing/2017/model3d" xmlns:o="urn:schemas-microsoft-com:office:office" xmlns:oel="http://schemas.microsoft.com/office/2019/extlst" xmlns:r="http://schemas.openxmlformats.org/officeDocument/2006/relationships" xmlns:m="http://schemas.openxmlformats.org/officeDocument/2006/math" xmlns:v="urn:schemas-microsoft-com:vml" xmlns:wp14="http://schemas.microsoft.com/office/word/2010/wordprocessingDrawing" xmlns:wp="http://schemas.openxmlformats.org/drawingml/2006/wordprocessingDrawing" xmlns:w10="urn:schemas-microsoft-com:office:word" xmlns:w="http://schemas.openxmlformats.org/wordprocessingml/2006/main" xmlns:w14="http://schemas.microsoft.com/office/word/2010/wordml" xmlns:w15="http://schemas.microsoft.com/office/word/2012/wordml" xmlns:w16cex="http://schemas.microsoft.com/office/word/2018/wordml/cex" xmlns:w16cid="http://schemas.microsoft.com/office/word/2016/wordml/cid" xmlns:w16="http://schemas.microsoft.com/office/word/2018/wordml" xmlns:w16sdtdh="http://schemas.microsoft.com/office/word/2020/wordml/sdtdatahash" xmlns:w16se="http://schemas.microsoft.com/office/word/2015/wordml/symex" xmlns:wpg="http://schemas.microsoft.com/office/word/2010/wordprocessingGroup" xmlns:wpi="http://schemas.microsoft.com/office/word/2010/wordprocessingInk" xmlns:wne="http://schemas.microsoft.com/office/word/2006/wordml" xmlns:wps="http://schemas.microsoft.com/office/word/2010/wordprocessingShape" mc:Ignorable="w14 w15 w16se w16cid w16 w16cex w16sdtdh wp14">
+<w:numbering xmlns:wpc="http://schemas.microsoft.com/office/word/2010/wordprocessingCanvas" xmlns:cx="http://schemas.microsoft.com/office/drawing/2014/chartex" xmlns:cx1="http://schemas.microsoft.com/office/drawing/2015/9/8/chartex" xmlns:cx2="http://schemas.microsoft.com/office/drawing/2015/10/21/chartex" xmlns:cx3="http://schemas.microsoft.com/office/drawing/2016/5/9/chartex" xmlns:cx4="http://schemas.microsoft.com/office/drawing/2016/5/10/chartex" xmlns:cx5="http://schemas.microsoft.com/office/drawing/2016/5/11/chartex" xmlns:cx6="http://schemas.microsoft.com/office/drawing/2016/5/12/chartex" xmlns:cx7="http://schemas.microsoft.com/office/drawing/2016/5/13/chartex" xmlns:cx8="http://schemas.microsoft.com/office/drawing/2016/5/14/chartex" xmlns:mc="http://schemas.openxmlformats.org/markup-compatibility/2006" xmlns:aink="http://schemas.microsoft.com/office/drawing/2016/ink" xmlns:am3d="http://schemas.microsoft.com/office/drawing/2017/model3d" xmlns:o="urn:schemas-microsoft-com:office:office" xmlns:r="http://schemas.openxmlformats.org/officeDocument/2006/relationships" xmlns:m="http://schemas.openxmlformats.org/officeDocument/2006/math" xmlns:v="urn:schemas-microsoft-com:vml" xmlns:wp14="http://schemas.microsoft.com/office/word/2010/wordprocessingDrawing" xmlns:wp="http://schemas.openxmlformats.org/drawingml/2006/wordprocessingDrawing" xmlns:w10="urn:schemas-microsoft-com:office:word" xmlns:w="http://schemas.openxmlformats.org/wordprocessingml/2006/main" xmlns:w14="http://schemas.microsoft.com/office/word/2010/wordml" xmlns:w15="http://schemas.microsoft.com/office/word/2012/wordml" xmlns:w16cex="http://schemas.microsoft.com/office/word/2018/wordml/cex" xmlns:w16cid="http://schemas.microsoft.com/office/word/2016/wordml/cid" xmlns:w16="http://schemas.microsoft.com/office/word/2018/wordml" xmlns:w16sdtdh="http://schemas.microsoft.com/office/word/2020/wordml/sdtdatahash" xmlns:w16se="http://schemas.microsoft.com/office/word/2015/wordml/symex" xmlns:wpg="http://schemas.microsoft.com/office/word/2010/wordprocessingGroup" xmlns:wpi="http://schemas.microsoft.com/office/word/2010/wordprocessingInk" xmlns:wne="http://schemas.microsoft.com/office/word/2006/wordml" xmlns:wps="http://schemas.microsoft.com/office/word/2010/wordprocessingShape" mc:Ignorable="w14 w15 w16se w16cid w16 w16cex w16sdtdh wp14">
   <w:abstractNum w:abstractNumId="0" w15:restartNumberingAfterBreak="0">
     <w:nsid w:val="035572D6"/>
     <w:multiLevelType w:val="hybridMultilevel"/>
@@ -10407,34 +10447,34 @@
       </w:pPr>
     </w:lvl>
   </w:abstractNum>
-  <w:num w:numId="1" w16cid:durableId="569190751">
+  <w:num w:numId="1">
     <w:abstractNumId w:val="7"/>
   </w:num>
-  <w:num w:numId="2" w16cid:durableId="629361026">
+  <w:num w:numId="2">
     <w:abstractNumId w:val="4"/>
   </w:num>
-  <w:num w:numId="3" w16cid:durableId="1651404179">
+  <w:num w:numId="3">
     <w:abstractNumId w:val="8"/>
   </w:num>
-  <w:num w:numId="4" w16cid:durableId="1391883386">
+  <w:num w:numId="4">
     <w:abstractNumId w:val="5"/>
   </w:num>
-  <w:num w:numId="5" w16cid:durableId="905065181">
+  <w:num w:numId="5">
     <w:abstractNumId w:val="0"/>
   </w:num>
-  <w:num w:numId="6" w16cid:durableId="2104833158">
+  <w:num w:numId="6">
     <w:abstractNumId w:val="1"/>
   </w:num>
-  <w:num w:numId="7" w16cid:durableId="630480039">
+  <w:num w:numId="7">
     <w:abstractNumId w:val="3"/>
   </w:num>
-  <w:num w:numId="8" w16cid:durableId="1549604026">
+  <w:num w:numId="8">
     <w:abstractNumId w:val="2"/>
   </w:num>
-  <w:num w:numId="9" w16cid:durableId="1675761306">
+  <w:num w:numId="9">
     <w:abstractNumId w:val="9"/>
   </w:num>
-  <w:num w:numId="10" w16cid:durableId="817965286">
+  <w:num w:numId="10">
     <w:abstractNumId w:val="6"/>
   </w:num>
 </w:numbering>

</xml_diff>

<commit_message>
Fix: Correcion en la redaccion del documento de casos de uso
</commit_message>
<xml_diff>
--- a/Documentacion/CASOS_DE_USO (2).docx
+++ b/Documentacion/CASOS_DE_USO (2).docx
@@ -4,7 +4,6 @@
   <w:body>
     <w:p>
       <w:pPr>
-        <w:ind w:left="2124" w:firstLine="708"/>
         <w:rPr>
           <w:rFonts w:cstheme="minorHAnsi"/>
           <w:b/>
@@ -806,6 +805,16 @@
           <w:szCs w:val="28"/>
         </w:rPr>
         <w:t xml:space="preserve"> de casos de uso</w:t>
+      </w:r>
+      <w:r>
+        <w:rPr>
+          <w:rFonts w:ascii="Arial" w:hAnsi="Arial" w:cs="Arial"/>
+          <w:b/>
+          <w:color w:val="auto"/>
+          <w:sz w:val="28"/>
+          <w:szCs w:val="28"/>
+        </w:rPr>
+        <w:t xml:space="preserve"> del proyecto TICO</w:t>
       </w:r>
     </w:p>
     <w:p>

</xml_diff>